<commit_message>
Refactor Day 9 lecture notes: Update titles, improve clarity, and enhance formatting for Z-intervals, hypothesis tests, and t-distributions. Add detailed step-by-step solutions for matched pairs and two-sample t procedures. Correct mathematical notation and ensure consistency in terminology throughout the document.
</commit_message>
<xml_diff>
--- a/Class Lectures/Day 9/Day 9.docx
+++ b/Class Lectures/Day 9/Day 9.docx
@@ -7,12 +7,12 @@
         <w:pStyle w:val="Title"/>
       </w:pPr>
       <w:r>
-        <w:t>Statistics I, Day 9: Z-Intervals, Z-Tests, Hypothesis Test Outcomes, T-Distributions, and Matched Pairs</w:t>
-      </w:r>
-    </w:p>
-    <w:p>
-      <w:r>
-        <w:t>Welcome to Day 9! Today we work through two problems, then talk about what can go wrong in a hypothesis test, and finally switch gears to t-distributions and matched pairs. Let us jump right in.</w:t>
+        <w:t>Statistics I, Day 9: Z-Intervals, Z-Tests, Hypothesis Test Outcomes, T-Distributions, Matched Pairs, and Two-Sample t Procedures</w:t>
+      </w:r>
+    </w:p>
+    <w:p>
+      <w:r>
+        <w:t>Welcome to Day 9! Today we work through two problems, then talk about what can go wrong in a hypothesis test, and finally switch gears to t-distributions, matched pairs, and two-sample t procedures. Let us jump right in.</w:t>
       </w:r>
     </w:p>
     <w:p>
@@ -82,7 +82,7 @@
         <w:rPr>
           <w:b/>
         </w:rPr>
-        <w:t>Condition 1 : Random sample:</w:t>
+        <w:t>Condition 1 - Random sample:</w:t>
       </w:r>
       <w:r>
         <w:t xml:space="preserve"> Is our sample randomly selected? Yes, it is.</w:t>
@@ -93,7 +93,7 @@
         <w:rPr>
           <w:b/>
         </w:rPr>
-        <w:t>Condition 2 : Normality:</w:t>
+        <w:t>Condition 2 - Normality:</w:t>
       </w:r>
       <w:r>
         <w:t xml:space="preserve"> Our sample size is n = 40, which is greater than 30. That means the Central Limit Theorem applies, so the sampling distribution is approximately normal. Check.</w:t>
@@ -104,7 +104,7 @@
         <w:rPr>
           <w:b/>
         </w:rPr>
-        <w:t>Condition 3 : Independence:</w:t>
+        <w:t>Condition 3 - Independence:</w:t>
       </w:r>
       <w:r>
         <w:t xml:space="preserve"> We need our sample of 40 bags to be less than 10 percent of all the potato chip bags out there. That is a safe assumption. Check.</w:t>
@@ -115,7 +115,7 @@
         <w:rPr>
           <w:b/>
         </w:rPr>
-        <w:t>Condition 4 : Known sigma:</w:t>
+        <w:t>Condition 4 - Known sigma:</w:t>
       </w:r>
       <w:r>
         <w:t xml:space="preserve"> We know σ = 1.4. Check.</w:t>
@@ -292,7 +292,7 @@
         <w:pStyle w:val="Heading1"/>
       </w:pPr>
       <w:r>
-        <w:t>Part 2: Hypothesis Test : Are the Bags Underfilled?</w:t>
+        <w:t>Part 2: Hypothesis Test — Are the Bags Underfilled?</w:t>
       </w:r>
     </w:p>
     <w:p>
@@ -962,22 +962,30 @@
     </w:p>
     <w:p>
       <w:r>
-        <w:t>H₀: μ = 0</w:t>
-      </w:r>
-    </w:p>
-    <w:p>
-      <w:r>
-        <w:t>Hₐ: μ ≠ 0</w:t>
-      </w:r>
-    </w:p>
-    <w:p>
-      <w:r>
-        <w:t>where μ is the actual mean difference for the entire population of parts.</w:t>
+        <w:t>H₀: μ_d = 0</w:t>
+      </w:r>
+    </w:p>
+    <w:p>
+      <w:r>
+        <w:t>Hₐ: μ_d ≠ 0</w:t>
+      </w:r>
+    </w:p>
+    <w:p>
+      <w:r>
+        <w:t>where μ_d is the actual mean difference for the entire population of parts.</w:t>
       </w:r>
     </w:p>
     <w:p>
       <w:r>
         <w:t>The histogram of the differences is reasonably symmetric with no outliers, so we can comfortably use the t procedures.</w:t>
+      </w:r>
+    </w:p>
+    <w:p>
+      <w:pPr>
+        <w:pStyle w:val="Heading2"/>
+      </w:pPr>
+      <w:r>
+        <w:t>Step-by-Step Solution</w:t>
       </w:r>
     </w:p>
     <w:p>
@@ -985,17 +993,30 @@
         <w:rPr>
           <w:b/>
         </w:rPr>
-        <w:t>Matched pairs t test statistic:</w:t>
-      </w:r>
-    </w:p>
-    <w:p>
-      <w:r>
-        <w:t>t = (x̄_d − μ₀) / (s_d / √n)</w:t>
-      </w:r>
-    </w:p>
-    <w:p>
-      <w:r>
-        <w:t>where:</w:t>
+        <w:t>Step 1: State the hypotheses</w:t>
+      </w:r>
+    </w:p>
+    <w:p>
+      <w:r>
+        <w:t>H₀: μ_d = 0</w:t>
+      </w:r>
+    </w:p>
+    <w:p>
+      <w:r>
+        <w:t>Hₐ: μ_d ≠ 0</w:t>
+      </w:r>
+    </w:p>
+    <w:p>
+      <w:r>
+        <w:t>This is a two-tailed test.</w:t>
+      </w:r>
+    </w:p>
+    <w:p>
+      <w:r>
+        <w:rPr>
+          <w:b/>
+        </w:rPr>
+        <w:t>Step 2: Check conditions</w:t>
       </w:r>
     </w:p>
     <w:p>
@@ -1003,7 +1024,7 @@
         <w:pStyle w:val="ListBullet"/>
       </w:pPr>
       <w:r>
-        <w:t>x̄_d is the mean of the differences</w:t>
+        <w:t>The data are paired (same 51 parts measured twice).</w:t>
       </w:r>
     </w:p>
     <w:p>
@@ -1011,7 +1032,7 @@
         <w:pStyle w:val="ListBullet"/>
       </w:pPr>
       <w:r>
-        <w:t>μ₀ is the hypothesized mean difference, 0 here</w:t>
+        <w:t>The histogram of differences is reasonably symmetric with no outliers.</w:t>
       </w:r>
     </w:p>
     <w:p>
@@ -1019,23 +1040,12 @@
         <w:pStyle w:val="ListBullet"/>
       </w:pPr>
       <w:r>
-        <w:t>s_d is the standard deviation of the differences</w:t>
-      </w:r>
-    </w:p>
-    <w:p>
-      <w:pPr>
-        <w:pStyle w:val="ListBullet"/>
-      </w:pPr>
-      <w:r>
-        <w:t>n is the number of pairs</w:t>
-      </w:r>
-    </w:p>
-    <w:p>
-      <w:pPr>
-        <w:pStyle w:val="ListBullet"/>
-      </w:pPr>
-      <w:r>
-        <w:t>s_d / √n is the standard error of the mean difference</w:t>
+        <w:t>The pairs are independent.</w:t>
+      </w:r>
+    </w:p>
+    <w:p>
+      <w:r>
+        <w:t>Conditions are met.</w:t>
       </w:r>
     </w:p>
     <w:p>
@@ -1043,25 +1053,52 @@
         <w:rPr>
           <w:b/>
         </w:rPr>
-        <w:t>Degrees of freedom:</w:t>
-      </w:r>
-    </w:p>
-    <w:p>
-      <w:r>
-        <w:t>df = n − 1</w:t>
-      </w:r>
-    </w:p>
-    <w:p>
-      <w:r>
-        <w:t>Here n = 51 pairs, so df = 51 − 1 = 50.</w:t>
-      </w:r>
-    </w:p>
-    <w:p>
-      <w:pPr>
-        <w:pStyle w:val="Heading2"/>
-      </w:pPr>
-      <w:r>
-        <w:t>Matched pairs t confidence interval</w:t>
+        <w:t>Step 3: Calculate sample statistics for the differences</w:t>
+      </w:r>
+    </w:p>
+    <w:p>
+      <w:r>
+        <w:t>The 51 differences (with option minus without option) are:</w:t>
+      </w:r>
+    </w:p>
+    <w:p>
+      <w:r>
+        <w:t>12, 8, 15, 10, 14, 9, 13, 11, 16, 12, 10, 14, 13, 9, 12, 15, 11, 13, 14, 10,</w:t>
+      </w:r>
+    </w:p>
+    <w:p>
+      <w:r>
+        <w:t>12, 11, 15, 13, 14, 11, 12, 14, 13, 10, 11, 14, 12, 13, 15, 11, 12, 14, 13, 10,</w:t>
+      </w:r>
+    </w:p>
+    <w:p>
+      <w:r>
+        <w:t>12, 14, 13, 11, 12, 15, 13, 12, 14, 11, 13</w:t>
+      </w:r>
+    </w:p>
+    <w:p>
+      <w:r>
+        <w:t>n = 51 pairs</w:t>
+      </w:r>
+    </w:p>
+    <w:p>
+      <w:r>
+        <w:t>Mean of differences:</w:t>
+      </w:r>
+    </w:p>
+    <w:p>
+      <w:r>
+        <w:t>x̄_d = Σdᵢ / n = 631 / 51 ≈ 12.3725</w:t>
+      </w:r>
+    </w:p>
+    <w:p>
+      <w:r>
+        <w:t>Standard deviation of differences:</w:t>
+      </w:r>
+    </w:p>
+    <w:p>
+      <w:r>
+        <w:t>s_d = √(Σ(dᵢ − x̄_d)² / (n − 1)) ≈ 1.7996</w:t>
       </w:r>
     </w:p>
     <w:p>
@@ -1069,17 +1106,82 @@
         <w:rPr>
           <w:b/>
         </w:rPr>
-        <w:t>Formula:</w:t>
-      </w:r>
-    </w:p>
-    <w:p>
-      <w:r>
-        <w:t>CI for μ_d = x̄_d ± t* · (s_d / √n)</w:t>
-      </w:r>
-    </w:p>
-    <w:p>
-      <w:r>
-        <w:t>where t* is the critical t-value for df = n − 1 and the desired confidence level.</w:t>
+        <w:t>Step 4: Calculate the standard error</w:t>
+      </w:r>
+    </w:p>
+    <w:p>
+      <w:r>
+        <w:t>SE = s_d / √n = 1.7996 / √51 = 1.7996 / 7.1414 ≈ 0.2520</w:t>
+      </w:r>
+    </w:p>
+    <w:p>
+      <w:r>
+        <w:rPr>
+          <w:b/>
+        </w:rPr>
+        <w:t>Step 5: Calculate the t test statistic</w:t>
+      </w:r>
+    </w:p>
+    <w:p>
+      <w:r>
+        <w:t>t = (x̄_d − μ₀) / SE = (12.3725 − 0) / 0.2520 ≈ 49.0995</w:t>
+      </w:r>
+    </w:p>
+    <w:p>
+      <w:r>
+        <w:rPr>
+          <w:b/>
+        </w:rPr>
+        <w:t>Step 6: Determine degrees of freedom</w:t>
+      </w:r>
+    </w:p>
+    <w:p>
+      <w:r>
+        <w:t>df = n − 1 = 51 − 1 = 50</w:t>
+      </w:r>
+    </w:p>
+    <w:p>
+      <w:r>
+        <w:rPr>
+          <w:b/>
+        </w:rPr>
+        <w:t>Step 7: Find the p-value</w:t>
+      </w:r>
+    </w:p>
+    <w:p>
+      <w:r>
+        <w:t>For a two-tailed test with df = 50:</w:t>
+      </w:r>
+    </w:p>
+    <w:p>
+      <w:r>
+        <w:t>p-value = 2 × P(t &gt; 49.0995) ≈ 0.0000</w:t>
+      </w:r>
+    </w:p>
+    <w:p>
+      <w:r>
+        <w:rPr>
+          <w:b/>
+        </w:rPr>
+        <w:t>Step 8: Make a decision</w:t>
+      </w:r>
+    </w:p>
+    <w:p>
+      <w:r>
+        <w:t>At α = 0.05: p-value ≈ 0.0000 &lt; 0.05, so reject H₀.</w:t>
+      </w:r>
+    </w:p>
+    <w:p>
+      <w:r>
+        <w:rPr>
+          <w:b/>
+        </w:rPr>
+        <w:t>Step 9: Conclusion</w:t>
+      </w:r>
+    </w:p>
+    <w:p>
+      <w:r>
+        <w:t>There is strong evidence at the 5% significance level that unchecking the software option changes measurement time. The mean difference is approximately 12.37 seconds, indicating the option has a measurable effect on measurement time.</w:t>
       </w:r>
     </w:p>
     <w:p>
@@ -1242,17 +1344,10 @@
     </w:p>
     <w:p>
       <w:pPr>
-        <w:pBdr>
-          <w:bottom w:val="single" w:sz="6" w:space="1" w:color="999999"/>
-        </w:pBdr>
+        <w:pStyle w:val="Heading2"/>
       </w:pPr>
-    </w:p>
-    <w:p>
-      <w:pPr>
-        <w:pStyle w:val="Heading1"/>
-      </w:pPr>
-      <w:r>
-        <w:t>Software Approximation for the Degrees of Freedom</w:t>
+      <w:r>
+        <w:t>Step-by-Step Solution: Two-Sample t Test</w:t>
       </w:r>
     </w:p>
     <w:p>
@@ -1260,10 +1355,22 @@
         <w:rPr>
           <w:b/>
         </w:rPr>
-        <w:t>Definition:</w:t>
-      </w:r>
-      <w:r>
-        <w:t xml:space="preserve"> The exact distribution of the two-sample t statistic is not a t distribution. The distribution changes as the unknown population standard deviations change. However, an excellent approximation is available.</w:t>
+        <w:t>Step 1: State the hypotheses</w:t>
+      </w:r>
+    </w:p>
+    <w:p>
+      <w:r>
+        <w:t>H₀: μ₁ − μ₂ = 0 (the treatment has no effect on reading ability)</w:t>
+      </w:r>
+    </w:p>
+    <w:p>
+      <w:r>
+        <w:t>Hₐ: μ₁ − μ₂ &gt; 0 (the treatment improves reading ability)</w:t>
+      </w:r>
+    </w:p>
+    <w:p>
+      <w:r>
+        <w:t>This is a right-tailed test.</w:t>
       </w:r>
     </w:p>
     <w:p>
@@ -1271,12 +1378,176 @@
         <w:rPr>
           <w:b/>
         </w:rPr>
-        <w:t>Approximate Distribution of the Two-Sample t Statistic:</w:t>
-      </w:r>
-    </w:p>
-    <w:p>
-      <w:r>
-        <w:t>The distribution of the two-sample t statistic is close to the t distribution with degrees of freedom given by:</w:t>
+        <w:t>Step 2: Check conditions</w:t>
+      </w:r>
+    </w:p>
+    <w:p>
+      <w:pPr>
+        <w:pStyle w:val="ListBullet"/>
+      </w:pPr>
+      <w:r>
+        <w:t>We have two independent random samples (treatment and control classrooms).</w:t>
+      </w:r>
+    </w:p>
+    <w:p>
+      <w:pPr>
+        <w:pStyle w:val="ListBullet"/>
+      </w:pPr>
+      <w:r>
+        <w:t>Both sample sizes are reasonable (n₁ = 21, n₂ = 23).</w:t>
+      </w:r>
+    </w:p>
+    <w:p>
+      <w:pPr>
+        <w:pStyle w:val="ListBullet"/>
+      </w:pPr>
+      <w:r>
+        <w:t>We assume the DRP scores are approximately Normal within each group.</w:t>
+      </w:r>
+    </w:p>
+    <w:p>
+      <w:pPr>
+        <w:pStyle w:val="ListBullet"/>
+      </w:pPr>
+      <w:r>
+        <w:t>The two samples are independent of each other.</w:t>
+      </w:r>
+    </w:p>
+    <w:p>
+      <w:r>
+        <w:t>Conditions are met.</w:t>
+      </w:r>
+    </w:p>
+    <w:p>
+      <w:r>
+        <w:rPr>
+          <w:b/>
+        </w:rPr>
+        <w:t>Step 3: Calculate sample statistics</w:t>
+      </w:r>
+    </w:p>
+    <w:p>
+      <w:r>
+        <w:t>For the treatment group (n₁ = 21):</w:t>
+      </w:r>
+    </w:p>
+    <w:p>
+      <w:r>
+        <w:t>Sum of scores = 1081</w:t>
+      </w:r>
+    </w:p>
+    <w:p>
+      <w:r>
+        <w:t>x̄₁ = 1081 / 21 ≈ 51.4762</w:t>
+      </w:r>
+    </w:p>
+    <w:p>
+      <w:r>
+        <w:t>s₁ = √(Σ(xᵢ − x̄₁)² / (n₁ − 1)) ≈ 11.0074</w:t>
+      </w:r>
+    </w:p>
+    <w:p>
+      <w:r>
+        <w:t>For the control group (n₂ = 23):</w:t>
+      </w:r>
+    </w:p>
+    <w:p>
+      <w:r>
+        <w:t>Sum of scores = 935</w:t>
+      </w:r>
+    </w:p>
+    <w:p>
+      <w:r>
+        <w:t>x̄₂ = 935 / 23 ≈ 40.6522</w:t>
+      </w:r>
+    </w:p>
+    <w:p>
+      <w:r>
+        <w:t>s₂ = √(Σ(xᵢ − x̄₂)² / (n₂ − 1)) ≈ 15.2453</w:t>
+      </w:r>
+    </w:p>
+    <w:p>
+      <w:r>
+        <w:rPr>
+          <w:b/>
+        </w:rPr>
+        <w:t>Step 4: Calculate the standard error</w:t>
+      </w:r>
+    </w:p>
+    <w:p>
+      <w:r>
+        <w:t>SE = √( (s₁)² / n₁ + (s₂)² / n₂ )</w:t>
+      </w:r>
+    </w:p>
+    <w:p>
+      <w:r>
+        <w:t>SE = √( (11.0074)² / 21 + (15.2453)² / 23 )</w:t>
+      </w:r>
+    </w:p>
+    <w:p>
+      <w:r>
+        <w:t>SE = √( 121.1629 / 21 + 232.4192 / 23 )</w:t>
+      </w:r>
+    </w:p>
+    <w:p>
+      <w:r>
+        <w:t>SE = √( 5.7697 + 10.1052 )</w:t>
+      </w:r>
+    </w:p>
+    <w:p>
+      <w:r>
+        <w:t>SE = √15.8749</w:t>
+      </w:r>
+    </w:p>
+    <w:p>
+      <w:r>
+        <w:t>SE ≈ 3.9843</w:t>
+      </w:r>
+    </w:p>
+    <w:p>
+      <w:r>
+        <w:rPr>
+          <w:b/>
+        </w:rPr>
+        <w:t>Step 5: Calculate the t test statistic</w:t>
+      </w:r>
+    </w:p>
+    <w:p>
+      <w:r>
+        <w:t>t = (x̄₁ − x̄₂) / SE</w:t>
+      </w:r>
+    </w:p>
+    <w:p>
+      <w:r>
+        <w:t>t = (51.4762 − 40.6522) / 3.9843</w:t>
+      </w:r>
+    </w:p>
+    <w:p>
+      <w:r>
+        <w:t>t = 10.8240 / 3.9843</w:t>
+      </w:r>
+    </w:p>
+    <w:p>
+      <w:r>
+        <w:t>t ≈ 2.7167</w:t>
+      </w:r>
+    </w:p>
+    <w:p>
+      <w:r>
+        <w:rPr>
+          <w:b/>
+        </w:rPr>
+        <w:t>Step 6: Determine degrees of freedom</w:t>
+      </w:r>
+    </w:p>
+    <w:p>
+      <w:r>
+        <w:t>Conservative approach: df = min(n₁ − 1, n₂ − 1) = min(20, 22) = 20</w:t>
+      </w:r>
+    </w:p>
+    <w:p>
+      <w:r>
+        <w:t>Software approximation:</w:t>
       </w:r>
     </w:p>
     <w:p>
@@ -1286,7 +1557,102 @@
     </w:p>
     <w:p>
       <w:r>
-        <w:t>This approximation is accurate when both sample sizes are 5 or larger.</w:t>
+        <w:t>df = ( 5.7697 + 10.1052 )² / ( (1/20) × (5.7697)² + (1/22) × (10.1052)² )</w:t>
+      </w:r>
+    </w:p>
+    <w:p>
+      <w:r>
+        <w:t>df = (15.8749)² / ( 0.05 × 33.2894 + 0.0455 × 102.1151 )</w:t>
+      </w:r>
+    </w:p>
+    <w:p>
+      <w:r>
+        <w:t>df = 252.0134 / ( 1.6645 + 4.6458 )</w:t>
+      </w:r>
+    </w:p>
+    <w:p>
+      <w:r>
+        <w:t>df = 252.0134 / 6.3103</w:t>
+      </w:r>
+    </w:p>
+    <w:p>
+      <w:r>
+        <w:t>df ≈ 39.94</w:t>
+      </w:r>
+    </w:p>
+    <w:p>
+      <w:r>
+        <w:rPr>
+          <w:b/>
+        </w:rPr>
+        <w:t>Step 7: Find the p-value</w:t>
+      </w:r>
+    </w:p>
+    <w:p>
+      <w:r>
+        <w:t>Using the conservative df = 20:</w:t>
+      </w:r>
+    </w:p>
+    <w:p>
+      <w:r>
+        <w:t>p-value = P(t &gt; 2.7167) with df = 20</w:t>
+      </w:r>
+    </w:p>
+    <w:p>
+      <w:r>
+        <w:t>p-value ≈ 0.0066</w:t>
+      </w:r>
+    </w:p>
+    <w:p>
+      <w:r>
+        <w:t>Using software df ≈ 39.94:</w:t>
+      </w:r>
+    </w:p>
+    <w:p>
+      <w:r>
+        <w:t>p-value ≈ 0.0048</w:t>
+      </w:r>
+    </w:p>
+    <w:p>
+      <w:r>
+        <w:rPr>
+          <w:b/>
+        </w:rPr>
+        <w:t>Step 8: Make a decision</w:t>
+      </w:r>
+    </w:p>
+    <w:p>
+      <w:r>
+        <w:t>At α = 0.05:</w:t>
+      </w:r>
+    </w:p>
+    <w:p>
+      <w:pPr>
+        <w:pStyle w:val="ListBullet"/>
+      </w:pPr>
+      <w:r>
+        <w:t>Conservative approach: 0.0066 &lt; 0.05, so reject H₀.</w:t>
+      </w:r>
+    </w:p>
+    <w:p>
+      <w:pPr>
+        <w:pStyle w:val="ListBullet"/>
+      </w:pPr>
+      <w:r>
+        <w:t>Software approach: 0.0048 &lt; 0.05, so reject H₀.</w:t>
+      </w:r>
+    </w:p>
+    <w:p>
+      <w:r>
+        <w:rPr>
+          <w:b/>
+        </w:rPr>
+        <w:t>Step 9: Conclusion</w:t>
+      </w:r>
+    </w:p>
+    <w:p>
+      <w:r>
+        <w:t>There is sufficient evidence at the 5% significance level to conclude that the directed reading activities improve reading ability. The mean DRP score for the treatment group is significantly higher than the control group.</w:t>
       </w:r>
     </w:p>
     <w:p>
@@ -1301,7 +1667,7 @@
         <w:pStyle w:val="Heading1"/>
       </w:pPr>
       <w:r>
-        <w:t>Pooled Two-Sample Procedures</w:t>
+        <w:t>Software Approximation for the Degrees of Freedom — Step-by-Step Example</w:t>
       </w:r>
     </w:p>
     <w:p>
@@ -1312,17 +1678,7 @@
         <w:t>Definition:</w:t>
       </w:r>
       <w:r>
-        <w:t xml:space="preserve"> There are two versions of the two-sample t-test: one assuming equal variance (the "pooled two-sample test") and one not assuming equal variance (the "unequal" variance test we have studied) for the two populations. They have slightly different formulas and degrees of freedom.</w:t>
-      </w:r>
-    </w:p>
-    <w:p>
-      <w:r>
-        <w:t>The pooled (equal variance) two-sample t test was often used before computers, because it has exactly the t distribution for degrees of freedom n₁ + n₂ − 2.</w:t>
-      </w:r>
-    </w:p>
-    <w:p>
-      <w:r>
-        <w:t>However, the assumption of equal variances is difficult to check; thus, the unequal variance test is safer.</w:t>
+        <w:t xml:space="preserve"> The exact distribution of the two-sample t statistic is not a t distribution. The distribution changes as the unknown population standard deviations change. However, an excellent approximation is available.</w:t>
       </w:r>
     </w:p>
     <w:p>
@@ -1330,7 +1686,198 @@
         <w:rPr>
           <w:b/>
         </w:rPr>
-        <w:t>Two Normally distributed populations with unequal variances:</w:t>
+        <w:t>Approximate Distribution of the Two-Sample t Statistic:</w:t>
+      </w:r>
+    </w:p>
+    <w:p>
+      <w:r>
+        <w:t>The distribution of the two-sample t statistic is close to the t distribution with degrees of freedom given by:</w:t>
+      </w:r>
+    </w:p>
+    <w:p>
+      <w:r>
+        <w:t>df = ( (s₁)² / n₁ + (s₂)² / n₂ )² / ( (1 / (n₁ − 1)) × ( (s₁)² / n₁ )² + (1 / (n₂ − 1)) × ( (s₂)² / n₂ )² )</w:t>
+      </w:r>
+    </w:p>
+    <w:p>
+      <w:r>
+        <w:t>This approximation is accurate when both sample sizes are 5 or larger.</w:t>
+      </w:r>
+    </w:p>
+    <w:p>
+      <w:pPr>
+        <w:pStyle w:val="Heading2"/>
+      </w:pPr>
+      <w:r>
+        <w:t>Step-by-Step Example</w:t>
+      </w:r>
+    </w:p>
+    <w:p>
+      <w:r>
+        <w:t>Using the directed reading activity data from the two-sample t test example:</w:t>
+      </w:r>
+    </w:p>
+    <w:p>
+      <w:r>
+        <w:rPr>
+          <w:b/>
+        </w:rPr>
+        <w:t>Step 1: Calculate the components</w:t>
+      </w:r>
+    </w:p>
+    <w:p>
+      <w:r>
+        <w:t>(s₁)² / n₁ = (11.0074)² / 21 = 121.1629 / 21 ≈ 5.7697</w:t>
+      </w:r>
+    </w:p>
+    <w:p>
+      <w:r>
+        <w:t>(s₂)² / n₂ = (15.2453)² / 23 = 232.4192 / 23 ≈ 10.1052</w:t>
+      </w:r>
+    </w:p>
+    <w:p>
+      <w:r>
+        <w:rPr>
+          <w:b/>
+        </w:rPr>
+        <w:t>Step 2: Calculate the numerator</w:t>
+      </w:r>
+    </w:p>
+    <w:p>
+      <w:r>
+        <w:t>Numerator = ( (s₁)² / n₁ + (s₂)² / n₂ )²</w:t>
+      </w:r>
+    </w:p>
+    <w:p>
+      <w:r>
+        <w:t>Numerator = ( 5.7697 + 10.1052 )²</w:t>
+      </w:r>
+    </w:p>
+    <w:p>
+      <w:r>
+        <w:t>Numerator = (15.8749)²</w:t>
+      </w:r>
+    </w:p>
+    <w:p>
+      <w:r>
+        <w:t>Numerator ≈ 252.0134</w:t>
+      </w:r>
+    </w:p>
+    <w:p>
+      <w:r>
+        <w:rPr>
+          <w:b/>
+        </w:rPr>
+        <w:t>Step 3: Calculate the denominator</w:t>
+      </w:r>
+    </w:p>
+    <w:p>
+      <w:r>
+        <w:t>First term: (1 / (n₁ − 1)) × ( (s₁)² / n₁ )²</w:t>
+      </w:r>
+    </w:p>
+    <w:p>
+      <w:r>
+        <w:t>= (1 / 20) × (5.7697)²</w:t>
+      </w:r>
+    </w:p>
+    <w:p>
+      <w:r>
+        <w:t>= 0.05 × 33.2894</w:t>
+      </w:r>
+    </w:p>
+    <w:p>
+      <w:r>
+        <w:t>≈ 1.6645</w:t>
+      </w:r>
+    </w:p>
+    <w:p>
+      <w:r>
+        <w:t>Second term: (1 / (n₂ − 1)) × ( (s₂)² / n₂ )²</w:t>
+      </w:r>
+    </w:p>
+    <w:p>
+      <w:r>
+        <w:t>= (1 / 22) × (10.1052)²</w:t>
+      </w:r>
+    </w:p>
+    <w:p>
+      <w:r>
+        <w:t>= 0.0455 × 102.1151</w:t>
+      </w:r>
+    </w:p>
+    <w:p>
+      <w:r>
+        <w:t>≈ 4.6458</w:t>
+      </w:r>
+    </w:p>
+    <w:p>
+      <w:r>
+        <w:t>Denominator = 1.6645 + 4.6458 ≈ 6.3103</w:t>
+      </w:r>
+    </w:p>
+    <w:p>
+      <w:r>
+        <w:rPr>
+          <w:b/>
+        </w:rPr>
+        <w:t>Step 4: Calculate df</w:t>
+      </w:r>
+    </w:p>
+    <w:p>
+      <w:r>
+        <w:t>df = Numerator / Denominator</w:t>
+      </w:r>
+    </w:p>
+    <w:p>
+      <w:r>
+        <w:t>df = 252.0134 / 6.3103</w:t>
+      </w:r>
+    </w:p>
+    <w:p>
+      <w:r>
+        <w:t>df ≈ 39.94</w:t>
+      </w:r>
+    </w:p>
+    <w:p>
+      <w:r>
+        <w:t>The software would round this down to 39 degrees of freedom for looking up critical values.</w:t>
+      </w:r>
+    </w:p>
+    <w:p>
+      <w:pPr>
+        <w:pBdr>
+          <w:bottom w:val="single" w:sz="6" w:space="1" w:color="999999"/>
+        </w:pBdr>
+      </w:pPr>
+    </w:p>
+    <w:p>
+      <w:pPr>
+        <w:pStyle w:val="Heading1"/>
+      </w:pPr>
+      <w:r>
+        <w:t>Pooled Two-Sample Procedures</w:t>
+      </w:r>
+    </w:p>
+    <w:p>
+      <w:r>
+        <w:rPr>
+          <w:b/>
+        </w:rPr>
+        <w:t>Definition:</w:t>
+      </w:r>
+      <w:r>
+        <w:t xml:space="preserve"> There are two versions of the two-sample t-test: one assuming equal variance (the "pooled two-sample test") and one not assuming equal variance (the "unequal" variance test we have studied) for the two populations. They have slightly different formulas and degrees of freedom.</w:t>
+      </w:r>
+    </w:p>
+    <w:p>
+      <w:r>
+        <w:t>The pooled (equal variance) two-sample t test was often used before computers, because it has exactly the t distribution for degrees of freedom n₁ + n₂ − 2.</w:t>
+      </w:r>
+    </w:p>
+    <w:p>
+      <w:r>
+        <w:t>However, the assumption of equal variances is difficult to check; thus, the unequal variance test is safer.</w:t>
       </w:r>
     </w:p>
     <w:p>

</xml_diff>